<commit_message>
docs: Manual Funcional + Documento de Lacunas COMPASSO v5.0
Updates both manuals for every change since v4.0: Fechamento Ano Fiscal
screen (2 tabs, formal AF close + per-project Carryover/Hold/Cancel/Revert,
replaces "Projetos Carry Over"); AF selector driven by anos_fiscais_config;
Quadro de Orcamento with project-count rows and Carry Over split into
Em Andamento / Em Hold; "Projetos Cancelados" row on the FY-creation panel;
project detail header redesign + "Decisoes de Fechamento" section; Go-Live
Termo de Aceite as a hard prerequisite for conclusion (project stays
"Pendente de Termo de Aceite" at 100%, cannot be signed before 100%).

Co-Authored-By: Claude Sonnet 5 <noreply@anthropic.com>
</commit_message>
<xml_diff>
--- a/docs/Manual_Funcional_COMPASSO.docx
+++ b/docs/Manual_Funcional_COMPASSO.docx
@@ -39,12 +39,12 @@
     </w:p>
     <w:p>
       <w:r>
-        <w:t>Versão 4.0 — 2 de setembro de 2026</w:t>
+        <w:t>Versão 5.0 — 2 de setembro de 2026</w:t>
       </w:r>
     </w:p>
     <w:p>
       <w:r>
-        <w:t>Primeira versão do manual sob a marca Compasso (evolução do sistema ONEBTB / OTB). Principais novidades desde a versão 3.0 do manual anterior: papel PROPRIETÁRIO e Licenciamento de Módulos; permissões por atividade agora com quatro verbos (Consultar, Incluir, Alterar, Deletar); proteção no banco de dados (RLS) ativada nas tabelas centrais de controle de acesso; Cadastro de Produtos e associação obrigatória de Produto à demanda; Agrupamento de Orçamento por Ano Fiscal, Área ou Produto no Dashboard e no Financeiro, com um novo Quadro de Orçamento; tela de Ajuste de Orçamento no menu Ano Fiscal; e padronização de nomenclatura (Ano Fiscal, Requerimentos, Especificação, Execução, Retorno/Benefícios de Projeto).</w:t>
+        <w:t>Versão do manual sob a marca Compasso (evolução do sistema ONEBTB / OTB). Novidades acumuladas nesta revisão: tela de Fechamento Ano Fiscal (menu Ano Fiscal), com duas abas — a avaliação consolidada do ano com o botão "Fechar Ano Fiscal" (fechamento formal, com log, distinto do fechamento do orçamento) e a decisão projeto a projeto (Carryover Desenvolvimento / Carryover Hold / Cancelar / Reverter) — substituindo a antiga tela "Projetos Carry Over"; o seletor de Ano Fiscal do Dashboard/Roadmap/Financeiro/Consulta passa a ser alimentado pela configuração de Anos Fiscais (lista de todos os AFs cadastrados + "Todos" + "Pipeline"), não mais pela data do dia; o Quadro de Orçamento ganhou duas linhas de contagem de projetos e separou o Carry Over em "Em Andamento" e "Em Hold"; o quadro "Projetos na Criação do Ano Fiscal" ganhou a linha de cancelados; o Detalhamento do Projeto teve o cabeçalho reorganizado e ganhou a seção "Decisões de Fechamento"; e o Termo de Aceite do Go-Live passou a ser pré-requisito real da conclusão do projeto, não podendo ser registrado antes dos 100% de evolução. Novidades das revisões anteriores, ainda vigentes: papel PROPRIETÁRIO e Licenciamento de Módulos; permissões por atividade com quatro verbos (Consultar, Incluir, Alterar, Deletar); proteção no banco de dados (RLS) ativada nas tabelas centrais de controle de acesso; Cadastro de Produtos e associação obrigatória de Produto à demanda; Agrupamento de Orçamento por Ano Fiscal, Área ou Produto; tela de Ajuste de Orçamento; e padronização de nomenclatura (Ano Fiscal, Requerimentos, Especificação, Execução, Retorno/Benefícios de Projeto).</w:t>
       </w:r>
     </w:p>
     <w:p>
@@ -295,7 +295,29 @@
           </w:tcPr>
           <w:p>
             <w:r>
-              <w:t>Marcação (não muda o Ano Fiscal do projeto) que indica que o saldo ainda não utilizado de um projeto será levado adiante para o próximo ciclo. O valor de carryover é sempre calculado automaticamente, nunca digitado. Também tem tratamento próprio, separado da aprovação do AF corrente.</w:t>
+              <w:t>Marcação (não muda o Ano Fiscal do projeto) que indica que o saldo ainda não utilizado de um projeto será levado adiante para o próximo ciclo. O valor de carryover é sempre calculado automaticamente, nunca digitado. É definido na aba "Avaliação Projetos Fechamento Ano Fiscal" da tela Fechamento Ano Fiscal (ver 4.2), em duas formas: Carryover Desenvolvimento (o projeto segue em andamento no próximo AF) e Carryover Hold (entra no próximo AF já em Hold). Tem tratamento próprio, separado da aprovação do AF corrente.</w:t>
+            </w:r>
+          </w:p>
+        </w:tc>
+      </w:tr>
+      <w:tr>
+        <w:tc>
+          <w:tcPr>
+            <w:tcW w:type="dxa" w:w="4153"/>
+          </w:tcPr>
+          <w:p>
+            <w:r>
+              <w:t>Fechamento de Ano Fiscal</w:t>
+            </w:r>
+          </w:p>
+        </w:tc>
+        <w:tc>
+          <w:tcPr>
+            <w:tcW w:type="dxa" w:w="4153"/>
+          </w:tcPr>
+          <w:p>
+            <w:r>
+              <w:t>NOVO. Encerramento formal de um Ano Fiscal — grava quem fechou, quando e um comentário, e passa a ser exigido para abrir o próximo AF. É diferente do fechamento do orçamento (5.5): um AF pode ter o orçamento fechado e ainda não estar formalmente encerrado. Só pode ser feito quando nenhum projeto do AF segue "em andamento" — todos precisam estar em Carryover, Hold ou Cancelado (ver 4.2).</w:t>
             </w:r>
           </w:p>
         </w:tc>
@@ -517,7 +539,7 @@
         <w:pStyle w:val="ListBullet"/>
       </w:pPr>
       <w:r>
-        <w:t>Ano Fiscal — abertura do ciclo orçamentário, projetos em Carryover e Ajuste de Orçamento.</w:t>
+        <w:t>Ano Fiscal — abertura do ciclo orçamentário, Fechamento Ano Fiscal (avaliação consolidada do ano, botão de fechamento formal e a decisão de Carryover/Hold/Cancelamento projeto a projeto) e Ajuste de Orçamento.</w:t>
       </w:r>
     </w:p>
     <w:p>
@@ -1043,15 +1065,25 @@
     </w:tbl>
     <w:p>
       <w:r>
-        <w:t>Fora dessa sequência linear existem: o caminho Extraordinário (demanda urgente aprovada via trade-off, entra direto em Requerimentos — 5.6), a marcação de Carryover (não muda a sequência, só sinaliza que o saldo será levado adiante — 4.2) e o Ajuste de Orçamento (autorização para mover orçamento entre áreas ou produtos diferentes — 4.3).</w:t>
+        <w:t>Fora dessa sequência linear existem: o caminho Extraordinário (demanda urgente aprovada via trade-off, entra direto em Requerimentos — 5.6), o Fechamento de Ano Fiscal (decisão de Carryover, Hold ou Cancelamento dos projetos que não terminam dentro do ano; não muda a sequência do projeto — 4.2) e o Ajuste de Orçamento (autorização para mover orçamento entre áreas ou produtos diferentes — 4.3).</w:t>
       </w:r>
     </w:p>
     <w:p>
+      <w:r>
+        <w:t>Ao concluir 100% do Go-Live o projeto NÃO é encerrado automaticamente: fica com o status "Pendente de Termo de Aceite" e só passa para Conclusão pela tela "Concluir Projeto/Subprojeto", depois de o Termo de Aceite ter sido registrado (ver 8.4 e 8.7).</w:t>
+      </w:r>
+    </w:p>
+    <w:p>
       <w:pPr>
         <w:pStyle w:val="Heading1"/>
       </w:pPr>
       <w:r>
         <w:t>4. Ano Fiscal</w:t>
+      </w:r>
+    </w:p>
+    <w:p>
+      <w:r>
+        <w:t>O sistema trabalha sempre com dois Anos Fiscais ao mesmo tempo: o AF em andamento e o AF seguinte (o "pipeline", onde ficam as demandas que ainda estão em Business Case). A configuração de Anos Fiscais é que alimenta os seletores de Ano Fiscal do Dashboard, Roadmap, Financeiro e Consulta de Projetos (ver 12.1) — não a data do dia.</w:t>
       </w:r>
     </w:p>
     <w:p>
@@ -1069,7 +1101,36 @@
     </w:p>
     <w:p>
       <w:r>
-        <w:t>Mostra o Ano Fiscal e o trimestre correntes, e permite abrir o recebimento de demandas para o próximo Ano Fiscal. A condição é que o AF corrente já esteja com o orçamento fechado e que o próximo ainda não tenha sido aberto. Também exibe o status de fechamento do orçamento do AF corrente (quem fechou e quando).</w:t>
+        <w:t>Mostra o Ano Fiscal e o trimestre correntes, um cartão com o "Ano Fiscal em Andamento", e permite abrir o recebimento de demandas para o próximo Ano Fiscal. Para abrir o próximo AF, três condições precisam estar satisfeitas ao mesmo tempo:</w:t>
+      </w:r>
+    </w:p>
+    <w:p>
+      <w:pPr>
+        <w:pStyle w:val="ListBullet"/>
+      </w:pPr>
+      <w:r>
+        <w:t>o AF corrente já está com o orçamento fechado (5.5);</w:t>
+      </w:r>
+    </w:p>
+    <w:p>
+      <w:pPr>
+        <w:pStyle w:val="ListBullet"/>
+      </w:pPr>
+      <w:r>
+        <w:t>o AF anterior ao corrente já está formalmente FECHADO (Fechamento de Ano Fiscal — 4.2);</w:t>
+      </w:r>
+    </w:p>
+    <w:p>
+      <w:pPr>
+        <w:pStyle w:val="ListBullet"/>
+      </w:pPr>
+      <w:r>
+        <w:t>o próximo AF ainda não foi aberto.</w:t>
+      </w:r>
+    </w:p>
+    <w:p>
+      <w:r>
+        <w:t>A tela também exibe o status de fechamento do orçamento e o status de fechamento formal de cada um desses anos (quem fechou e quando).</w:t>
       </w:r>
     </w:p>
     <w:p>
@@ -1082,27 +1143,195 @@
         <w:pStyle w:val="Heading2"/>
       </w:pPr>
       <w:r>
-        <w:t>4.2 Projetos Carry Over</w:t>
+        <w:t>4.2 Fechamento Ano Fiscal</w:t>
       </w:r>
     </w:p>
     <w:p>
       <w:r>
-        <w:t>Onde: Ano Fiscal &gt; Projetos Carry Over.</w:t>
+        <w:t>Onde: Ano Fiscal &gt; Fechamento Ano Fiscal. Substitui a antiga tela "Projetos Carry Over" — todas as ações de Carryover passaram para cá. Podem registrar decisões e fechar o ano: Governança, Gestor de TI e sempre Administrador / Proprietário; os demais perfis só consultam.</w:t>
       </w:r>
     </w:p>
     <w:p>
       <w:r>
-        <w:t>Lista todos os projetos ativos com os três valores de orçamento (Business Case / Requerimentos / Especificação). Marcar um projeto como Carryover liga uma flag no projeto — não altera o Ano Fiscal dele. O valor de carryover é sempre calculado automaticamente: o orçamento mais recente definido menos o que já foi realizado.</w:t>
+        <w:t>Qual Ano Fiscal a tela trata (o "AF alvo", que está sendo encerrado): quando o trimestre corrente é o Q4, é o próprio Ano Fiscal em curso; nos trimestres Q1, Q2 ou Q3, é sempre o Ano Fiscal anterior ao em curso. O AF alvo aparece no topo da tela.</w:t>
       </w:r>
     </w:p>
     <w:p>
       <w:r>
-        <w:t>Candidatos NOVOS a marcar só aparecem a partir do último trimestre (Q4) do Ano Fiscal corrente; fora do Q4, a tela mostra só os projetos já marcados. Todos os projetos marcados formam um pool de orçamento por Ano Fiscal de destino, mostrado nesta tela, no Dashboard e no Financeiro.</w:t>
+        <w:t>A tela tem duas abas:</w:t>
+      </w:r>
+    </w:p>
+    <w:p>
+      <w:pPr>
+        <w:pStyle w:val="Heading2"/>
+      </w:pPr>
+      <w:r>
+        <w:t>4.2.1 Aba "Avaliação e Fechamento Ano Fiscal"</w:t>
       </w:r>
     </w:p>
     <w:p>
       <w:r>
-        <w:t>Desmarcar só é permitido enquanto o projeto não tiver avançado de fase nem de status desde o momento em que foi marcado.</w:t>
+        <w:t>Visão consolidada do resultado do AF alvo (contagem de projetos por situação, orçamento por fase e o mesmo Quadro de Orçamento do Dashboard — ver 12.3), com o seletor de agrupamento por Área/Produto (12.2). No topo fica o botão "Fechar Ano Fiscal [AF]".</w:t>
+      </w:r>
+    </w:p>
+    <w:p>
+      <w:r>
+        <w:t>Fechar o Ano Fiscal abre uma confirmação com uma caixa de comentário; ao confirmar, o sistema grava que o AF foi fechado (quem, quando e o comentário) e registra um log formal. O fechamento formal do Ano Fiscal é DIFERENTE do fechamento do orçamento (5.5): são dois marcos independentes.</w:t>
+      </w:r>
+    </w:p>
+    <w:p>
+      <w:r>
+        <w:t>O botão só fica habilitado quando NENHUM projeto do AF alvo ainda está "em andamento" — todos precisam ter sido colocados em Carryover Desenvolvimento, Carryover Hold ou Cancelado na aba ao lado. Enquanto houver pendência, a tela mostra "EXISTEM PROJETOS EM ANDAMENTO. TRATE TODOS NA ABA DE AVALIAÇÃO".</w:t>
+      </w:r>
+    </w:p>
+    <w:p>
+      <w:r>
+        <w:t>O fechamento do Ano Fiscal NÃO altera nada nos projetos — não move orçamento, não muda fase nem status. Ele só grava o marco, o log, e passa a ser exigido para abrir o próximo AF (4.1).</w:t>
+      </w:r>
+    </w:p>
+    <w:p>
+      <w:pPr>
+        <w:pStyle w:val="Heading2"/>
+      </w:pPr>
+      <w:r>
+        <w:t>4.2.2 Aba "Avaliação Projetos Fechamento Ano Fiscal"</w:t>
+      </w:r>
+    </w:p>
+    <w:p>
+      <w:r>
+        <w:t>Lista os projetos do AF alvo que ainda não terminaram (fora subprojetos, concluídos, cancelados e reprovados), com orçamento atual, realizado, saldo remanescente (calculado automaticamente: orçamento mais recente menos o realizado) e a decisão atual de cada um. O pool de Carryover para o próximo AF aparece num cartão no topo. Cada projeto oferece quatro ações:</w:t>
+      </w:r>
+    </w:p>
+    <w:tbl>
+      <w:tblPr>
+        <w:tblStyle w:val="LightGrid-Accent1"/>
+        <w:tblW w:type="auto" w:w="0"/>
+        <w:tblLook w:firstColumn="1" w:firstRow="1" w:lastColumn="0" w:lastRow="0" w:noHBand="0" w:noVBand="1" w:val="04A0"/>
+      </w:tblPr>
+      <w:tblGrid>
+        <w:gridCol w:w="4153"/>
+        <w:gridCol w:w="4153"/>
+      </w:tblGrid>
+      <w:tr>
+        <w:tc>
+          <w:tcPr>
+            <w:tcW w:type="dxa" w:w="4153"/>
+          </w:tcPr>
+          <w:p>
+            <w:r>
+              <w:rPr>
+                <w:b/>
+              </w:rPr>
+              <w:t>Ação</w:t>
+            </w:r>
+          </w:p>
+        </w:tc>
+        <w:tc>
+          <w:tcPr>
+            <w:tcW w:type="dxa" w:w="4153"/>
+          </w:tcPr>
+          <w:p>
+            <w:r>
+              <w:rPr>
+                <w:b/>
+              </w:rPr>
+              <w:t>O que faz</w:t>
+            </w:r>
+          </w:p>
+        </w:tc>
+      </w:tr>
+      <w:tr>
+        <w:tc>
+          <w:tcPr>
+            <w:tcW w:type="dxa" w:w="4153"/>
+          </w:tcPr>
+          <w:p>
+            <w:r>
+              <w:t>Carryover Desenvolvimento</w:t>
+            </w:r>
+          </w:p>
+        </w:tc>
+        <w:tc>
+          <w:tcPr>
+            <w:tcW w:type="dxa" w:w="4153"/>
+          </w:tcPr>
+          <w:p>
+            <w:r>
+              <w:t>Marca o projeto como Carryover (o saldo remanescente entra no pool do próximo AF). O projeto segue em andamento — só passa a ser "projeto do ano que vem".</w:t>
+            </w:r>
+          </w:p>
+        </w:tc>
+      </w:tr>
+      <w:tr>
+        <w:tc>
+          <w:tcPr>
+            <w:tcW w:type="dxa" w:w="4153"/>
+          </w:tcPr>
+          <w:p>
+            <w:r>
+              <w:t>Carryover Hold</w:t>
+            </w:r>
+          </w:p>
+        </w:tc>
+        <w:tc>
+          <w:tcPr>
+            <w:tcW w:type="dxa" w:w="4153"/>
+          </w:tcPr>
+          <w:p>
+            <w:r>
+              <w:t>Marca como Carryover e além disso coloca o projeto em Hold (status "HOLD", guardando o status anterior). Também entra no pool do próximo AF; sai das telas operacionais e passa a aparecer em Governança &gt; Retomar Projetos em Hold.</w:t>
+            </w:r>
+          </w:p>
+        </w:tc>
+      </w:tr>
+      <w:tr>
+        <w:tc>
+          <w:tcPr>
+            <w:tcW w:type="dxa" w:w="4153"/>
+          </w:tcPr>
+          <w:p>
+            <w:r>
+              <w:t>Cancelar</w:t>
+            </w:r>
+          </w:p>
+        </w:tc>
+        <w:tc>
+          <w:tcPr>
+            <w:tcW w:type="dxa" w:w="4153"/>
+          </w:tcPr>
+          <w:p>
+            <w:r>
+              <w:t>Cancela o projeto (status "CANCELADO"), pedindo o motivo. Se era Carryover, a marcação de carryover é desfeita.</w:t>
+            </w:r>
+          </w:p>
+        </w:tc>
+      </w:tr>
+      <w:tr>
+        <w:tc>
+          <w:tcPr>
+            <w:tcW w:type="dxa" w:w="4153"/>
+          </w:tcPr>
+          <w:p>
+            <w:r>
+              <w:t>Reverter</w:t>
+            </w:r>
+          </w:p>
+        </w:tc>
+        <w:tc>
+          <w:tcPr>
+            <w:tcW w:type="dxa" w:w="4153"/>
+          </w:tcPr>
+          <w:p>
+            <w:r>
+              <w:t>Desfaz a última decisão registrada para o projeto (tira o Carryover, sai do Hold ou do Cancelamento) e devolve o projeto ao status em que estava.</w:t>
+            </w:r>
+          </w:p>
+        </w:tc>
+      </w:tr>
+    </w:tbl>
+    <w:p>
+      <w:r>
+        <w:t>Toda decisão fica registrada em log próprio (decisão, valor remanescente, quem decidiu e quando), visível no Detalhamento do Projeto (seção "Decisões de Fechamento" — ver 12.10). Para Carryover (Desenvolvimento ou Hold), o sistema reconfere a elegibilidade — entre outras coisas, o próximo Ano Fiscal precisa já existir na configuração.</w:t>
       </w:r>
     </w:p>
     <w:p>
@@ -1552,7 +1781,12 @@
     </w:p>
     <w:p>
       <w:r>
-        <w:t>Registro formal do aceite do projeto: quem aceitou, data, ressalvas e observações. Fica editável até a conclusão do projeto. Não pode ser preenchido enquanto existir qualquer ocorrência de erro em aberto.</w:t>
+        <w:t>Registro formal do aceite do projeto: quem aceitou, data, ressalvas e observações. Fica editável até a conclusão do projeto.</w:t>
+      </w:r>
+    </w:p>
+    <w:p>
+      <w:r>
+        <w:t>O Termo só pode ser registrado depois que a evolução do Go-Live chega a 100%. Antes disso, na lista da sub-aba "Termo de Aceite" o botão aparece como "Aguardando 100%", e se o modal for aberto ele fica só para consulta, com o aviso de que a evolução ainda não fechou. Também continua bloqueado enquanto existir qualquer ocorrência de erro em aberto.</w:t>
       </w:r>
     </w:p>
     <w:p>
@@ -1591,7 +1825,7 @@
     </w:p>
     <w:p>
       <w:r>
-        <w:t>Onde: Execução &gt; Concluir Projeto / Subprojeto. Baixa definitiva do projeto, feita depois que Go-Live foi concluído a 100%. Exige data de conclusão e observação (exibida no Detalhamento do Projeto).</w:t>
+        <w:t>Onde: Execução &gt; Concluir Projeto / Subprojeto. Baixa definitiva do projeto. É a ÚNICA forma de um projeto passar para Conclusão: ao registrar 100% no Go-Live o projeto não é encerrado automaticamente — ele fica com o status "Pendente de Termo de Aceite", ainda na fase de Go-Live, e aguarda esta tela. Exige data de conclusão e observação (exibida no Detalhamento do Projeto).</w:t>
       </w:r>
     </w:p>
     <w:p>
@@ -1833,7 +2067,36 @@
     </w:p>
     <w:p>
       <w:r>
-        <w:t>Dashboard, Consulta de Projetos, Roadmap e Financeiro compartilham o mesmo tipo de seletor de Ano Fiscal (Corrente / Próximo AF-Pipeline / Todos) — cada tela guarda sua própria seleção.</w:t>
+        <w:t>Dashboard, Consulta de Projetos, Roadmap e Financeiro compartilham o mesmo tipo de seletor de Ano Fiscal. A lista de opções é montada a partir da configuração de Anos Fiscais (4), não da data do dia:</w:t>
+      </w:r>
+    </w:p>
+    <w:p>
+      <w:pPr>
+        <w:pStyle w:val="ListBullet"/>
+      </w:pPr>
+      <w:r>
+        <w:t>uma opção para cada Ano Fiscal cadastrado (ex.: "Ano Fiscal AF2026", "Ano Fiscal AF2027"), com uma etiqueta indicando se o orçamento/ano está aberto, fechado ou em pipeline;</w:t>
+      </w:r>
+    </w:p>
+    <w:p>
+      <w:pPr>
+        <w:pStyle w:val="ListBullet"/>
+      </w:pPr>
+      <w:r>
+        <w:t>"Pipeline" — só os projetos do próximo AF que ainda estão em Business Case;</w:t>
+      </w:r>
+    </w:p>
+    <w:p>
+      <w:pPr>
+        <w:pStyle w:val="ListBullet"/>
+      </w:pPr>
+      <w:r>
+        <w:t>"Todos" — o portfólio inteiro, de todos os anos.</w:t>
+      </w:r>
+    </w:p>
+    <w:p>
+      <w:r>
+        <w:t>Cada tela guarda a sua própria seleção. Ao escolher um Ano Fiscal específico, os projetos em Carryover aparecem junto, independentemente do ano de origem. O Dashboard, o Roadmap e o Financeiro abrem no AF em andamento; a Consulta de Projetos abre em "Todos".</w:t>
       </w:r>
     </w:p>
     <w:p>
@@ -1888,7 +2151,7 @@
     </w:p>
     <w:p>
       <w:r>
-        <w:t>NOVO. Substitui os antigos cartões de KPI e os quadros separados de CAPEX/OPEX e de Carry Over. É uma tabela única, com o cabeçalho "Visão por: [seleção ativa]", 7 linhas e 3 colunas (Total, CAPEX, OPEX):</w:t>
+        <w:t>NOVO. Substitui os antigos cartões de KPI e os quadros separados de CAPEX/OPEX e de Carry Over. É uma tabela única, com o cabeçalho "Visão por: [seleção ativa]" e 3 colunas (Total, CAPEX, OPEX). As duas primeiras linhas são contagens de projetos; as demais são valores em R$:</w:t>
       </w:r>
     </w:p>
     <w:tbl>
@@ -1936,7 +2199,7 @@
           </w:tcPr>
           <w:p>
             <w:r>
-              <w:t>Total de Projetos</w:t>
+              <w:t>Total de Projetos para Gerar Orçamento</w:t>
             </w:r>
           </w:p>
         </w:tc>
@@ -1946,7 +2209,29 @@
           </w:tcPr>
           <w:p>
             <w:r>
-              <w:t>Contagem de projetos ativos no recorte atual (não é um valor em R$).</w:t>
+              <w:t>Contagem dos projetos do recorte que ainda estão em Business Case, antes de ter orçamento. Sem separação CAPEX/OPEX.</w:t>
+            </w:r>
+          </w:p>
+        </w:tc>
+      </w:tr>
+      <w:tr>
+        <w:tc>
+          <w:tcPr>
+            <w:tcW w:type="dxa" w:w="4153"/>
+          </w:tcPr>
+          <w:p>
+            <w:r>
+              <w:t>Total de Projetos com Orçamento</w:t>
+            </w:r>
+          </w:p>
+        </w:tc>
+        <w:tc>
+          <w:tcPr>
+            <w:tcW w:type="dxa" w:w="4153"/>
+          </w:tcPr>
+          <w:p>
+            <w:r>
+              <w:t>Contagem dos projetos do recorte que já compõem o total do ano — aprovados, Carryover ou Extraordinários.</w:t>
             </w:r>
           </w:p>
         </w:tc>
@@ -2002,7 +2287,7 @@
           </w:tcPr>
           <w:p>
             <w:r>
-              <w:t>Orçamento Carry Over</w:t>
+              <w:t>Orçamento Carry Over — Em Andamento</w:t>
             </w:r>
           </w:p>
         </w:tc>
@@ -2012,7 +2297,29 @@
           </w:tcPr>
           <w:p>
             <w:r>
-              <w:t>Soma dos saldos de carryover congelados na marcação.</w:t>
+              <w:t>Soma dos saldos de carryover congelados dos projetos em Carryover Desenvolvimento (que seguem em andamento).</w:t>
+            </w:r>
+          </w:p>
+        </w:tc>
+      </w:tr>
+      <w:tr>
+        <w:tc>
+          <w:tcPr>
+            <w:tcW w:type="dxa" w:w="4153"/>
+          </w:tcPr>
+          <w:p>
+            <w:r>
+              <w:t>Orçamento Carry Over — Em Hold</w:t>
+            </w:r>
+          </w:p>
+        </w:tc>
+        <w:tc>
+          <w:tcPr>
+            <w:tcW w:type="dxa" w:w="4153"/>
+          </w:tcPr>
+          <w:p>
+            <w:r>
+              <w:t>Soma dos saldos de carryover congelados dos projetos em Carryover Hold.</w:t>
             </w:r>
           </w:p>
         </w:tc>
@@ -2034,7 +2341,7 @@
           </w:tcPr>
           <w:p>
             <w:r>
-              <w:t>Orçamento Fechado + Extraordinário + Carry Over — o total vigente do recorte.</w:t>
+              <w:t>Fechado + Extraordinário + Carry Over (Em Andamento + Em Hold) — o total vigente do recorte.</w:t>
             </w:r>
           </w:p>
         </w:tc>
@@ -2098,6 +2405,11 @@
       </w:r>
     </w:p>
     <w:p>
+      <w:r>
+        <w:t>O quadro "Projetos na Criação do Ano Fiscal" tem, como última linha antes do total, o "Total de Projetos Cancelados" do recorte.</w:t>
+      </w:r>
+    </w:p>
+    <w:p>
       <w:pPr>
         <w:pStyle w:val="Heading2"/>
       </w:pPr>
@@ -2172,7 +2484,12 @@
     </w:p>
     <w:p>
       <w:r>
-        <w:t>Acessado clicando no código de qualquer projeto. Além do cabeçalho completo, valores por fase, linha do tempo de etapas e histórico de Hold/trade-off, mostra: a Observação de Conclusão do Projeto; as Ocorrências de Go-Live e o Termo de Aceite (quando o projeto passou por Go-Live); e os Vínculos de Contrato, com o histórico completo de criação/alteração/exclusão.</w:t>
+        <w:t>Acessado clicando no código de qualquer projeto. O cabeçalho é organizado em blocos rotulados, com divisórias, e os títulos que descrevem o projeto aparecem em azul e negrito para destaque.</w:t>
+      </w:r>
+    </w:p>
+    <w:p>
+      <w:r>
+        <w:t>Além do cabeçalho, valores por fase, linha do tempo de etapas e histórico de Hold/trade-off, mostra: a Observação de Conclusão do Projeto; as Ocorrências de Go-Live e o Termo de Aceite (quando o projeto passou por Go-Live); a seção "Decisões de Fechamento" (o histórico de Carryover Desenvolvimento / Carryover Hold / Cancelamento / Reversão feito na tela Fechamento Ano Fiscal — ver 4.2); e os Vínculos de Contrato, com o histórico completo de criação/alteração/exclusão.</w:t>
       </w:r>
     </w:p>
     <w:p>
@@ -2913,7 +3230,51 @@
           </w:tcPr>
           <w:p>
             <w:r>
-              <w:t>Marcação de que o saldo não utilizado de um projeto será levado para o próximo AF.</w:t>
+              <w:t>Marcação de que o saldo não utilizado de um projeto será levado para o próximo AF. Definido na tela Fechamento Ano Fiscal, como Carryover Desenvolvimento (segue em andamento) ou Carryover Hold (entra no próximo AF em Hold).</w:t>
+            </w:r>
+          </w:p>
+        </w:tc>
+      </w:tr>
+      <w:tr>
+        <w:tc>
+          <w:tcPr>
+            <w:tcW w:type="dxa" w:w="4153"/>
+          </w:tcPr>
+          <w:p>
+            <w:r>
+              <w:t>Fechamento de Ano Fiscal</w:t>
+            </w:r>
+          </w:p>
+        </w:tc>
+        <w:tc>
+          <w:tcPr>
+            <w:tcW w:type="dxa" w:w="4153"/>
+          </w:tcPr>
+          <w:p>
+            <w:r>
+              <w:t>Encerramento formal de um AF (quem/quando/comentário + log), exigido para abrir o próximo AF; diferente do fechamento do orçamento.</w:t>
+            </w:r>
+          </w:p>
+        </w:tc>
+      </w:tr>
+      <w:tr>
+        <w:tc>
+          <w:tcPr>
+            <w:tcW w:type="dxa" w:w="4153"/>
+          </w:tcPr>
+          <w:p>
+            <w:r>
+              <w:t>Pendente de Termo de Aceite</w:t>
+            </w:r>
+          </w:p>
+        </w:tc>
+        <w:tc>
+          <w:tcPr>
+            <w:tcW w:type="dxa" w:w="4153"/>
+          </w:tcPr>
+          <w:p>
+            <w:r>
+              <w:t>Status de um projeto que atingiu 100% no Go-Live e aguarda o Termo de Aceite para poder ser concluído.</w:t>
             </w:r>
           </w:p>
         </w:tc>

</xml_diff>

<commit_message>
Formalizar Demanda: pick fiscal years from anos_fiscais_config, not the date
popularOpcoesAFDemanda built the "Extraordinaria" option from
getInfoAnoFiscal().afAtualStr (a date calculation), so the AF actually in
progress (orcamento_fechado=true, ano_fiscal_fechado!=true) was never
offered and only the pipeline AF showed up. Now:

- Normal option  = AF in budgeting (obterAFAbertoParaDemandas, unchanged)
- Extraordinaria = AF in progress via afEmAndamentoStr() (orcamento_fechado
  and not ano_fiscal_fechado); a formally closed AF is not offered.
- saveBusinessCase also rejects an Extraordinaria for an AF with
  ano_fiscal_fechado=true.

Manuals regenerated: Manual section 5.1 now documents the AF selector rule.

Co-Authored-By: Claude Sonnet 5 <noreply@anthropic.com>
</commit_message>
<xml_diff>
--- a/docs/Manual_Funcional_COMPASSO.docx
+++ b/docs/Manual_Funcional_COMPASSO.docx
@@ -1381,6 +1381,32 @@
     <w:p>
       <w:r>
         <w:t>Onde: Business Case &gt; Formalizar Demanda. Ponto de entrada de qualquer demanda nova.</w:t>
+      </w:r>
+    </w:p>
+    <w:p>
+      <w:r>
+        <w:t>O primeiro campo é o Ano Fiscal da demanda, um select montado a partir da configuração de Anos Fiscais (4), com até duas opções:</w:t>
+      </w:r>
+    </w:p>
+    <w:p>
+      <w:pPr>
+        <w:pStyle w:val="ListBullet"/>
+      </w:pPr>
+      <w:r>
+        <w:t>o Ano Fiscal em orçamentação (o "pipeline", ainda com o orçamento aberto) — recebe demanda NORMAL;</w:t>
+      </w:r>
+    </w:p>
+    <w:p>
+      <w:pPr>
+        <w:pStyle w:val="ListBullet"/>
+      </w:pPr>
+      <w:r>
+        <w:t>o Ano Fiscal em andamento (orçamento já fechado e o ano ainda não encerrado formalmente) — recebe apenas Demanda EXTRAORDINÁRIA: ao escolhê-lo, aparece o aviso e a confirmação Sim/Não, e os campos só liberam após o "Sim". Um Ano Fiscal já encerrado (Fechamento Ano Fiscal — 4.2) não aparece.</w:t>
+      </w:r>
+    </w:p>
+    <w:p>
+      <w:r>
+        <w:t>Se nenhum dos dois existir no momento, o select mostra "Nenhum AF disponível".</w:t>
       </w:r>
     </w:p>
     <w:p>

</xml_diff>

<commit_message>
docs: Manual Funcional COMPASSO v6.0 (budget-control / FY-period / licensing §2.6)
Co-Authored-By: Claude Sonnet 5 <noreply@anthropic.com>
</commit_message>
<xml_diff>
--- a/docs/Manual_Funcional_COMPASSO.docx
+++ b/docs/Manual_Funcional_COMPASSO.docx
@@ -39,12 +39,12 @@
     </w:p>
     <w:p>
       <w:r>
-        <w:t>Versão 5.0 — 2 de setembro de 2026</w:t>
+        <w:t>Versão 6.0 — 3 de setembro de 2026</w:t>
       </w:r>
     </w:p>
     <w:p>
       <w:r>
-        <w:t>Versão do manual sob a marca Compasso (evolução do sistema ONEBTB / OTB). Novidades acumuladas nesta revisão: tela de Fechamento Ano Fiscal (menu Ano Fiscal), com duas abas — a avaliação consolidada do ano com o botão "Fechar Ano Fiscal" (fechamento formal, com log, distinto do fechamento do orçamento) e a decisão projeto a projeto (Carryover Desenvolvimento / Carryover Hold / Cancelar / Reverter) — substituindo a antiga tela "Projetos Carry Over"; o seletor de Ano Fiscal do Dashboard/Roadmap/Financeiro/Consulta passa a ser alimentado pela configuração de Anos Fiscais (lista de todos os AFs cadastrados + "Todos" + "Pipeline"), não mais pela data do dia; o Quadro de Orçamento ganhou duas linhas de contagem de projetos e separou o Carry Over em "Em Andamento" e "Em Hold"; o quadro "Projetos na Criação do Ano Fiscal" ganhou a linha de cancelados; o Detalhamento do Projeto teve o cabeçalho reorganizado e ganhou a seção "Decisões de Fechamento"; e o Termo de Aceite do Go-Live passou a ser pré-requisito real da conclusão do projeto, não podendo ser registrado antes dos 100% de evolução. Novidades das revisões anteriores, ainda vigentes: papel PROPRIETÁRIO e Licenciamento de Módulos; permissões por atividade com quatro verbos (Consultar, Incluir, Alterar, Deletar); proteção no banco de dados (RLS) ativada nas tabelas centrais de controle de acesso; Cadastro de Produtos e associação obrigatória de Produto à demanda; Agrupamento de Orçamento por Ano Fiscal, Área ou Produto; tela de Ajuste de Orçamento; e padronização de nomenclatura (Ano Fiscal, Requerimentos, Especificação, Execução, Retorno/Benefícios de Projeto).</w:t>
+        <w:t>Novidades da versão 6.0: (Administração) "Controle Orçamentário" — parâmetro que define se o trade-off da Demanda Extraordinária considera todos os projetos do Ano Fiscal (padrão), só os da mesma Área ou só os do mesmo Produto do projeto extraordinário; (Administração) "Período do Ano Fiscal" — o mês em que o Ano Fiscal começa deixou de ser fixo (abril) e passou a ser configurável, com vigência; (Ano Fiscal) "Validação de Trade-off Extraordinário" — fila de aprovação para as simulações de trade-off que cruzam Área/Produto. Novidades da versão 5.0 (ainda vigentes): Versão do manual sob a marca Compasso (evolução do sistema ONEBTB / OTB). Novidades acumuladas nesta revisão: tela de Fechamento Ano Fiscal (menu Ano Fiscal), com duas abas — a avaliação consolidada do ano com o botão "Fechar Ano Fiscal" (fechamento formal, com log, distinto do fechamento do orçamento) e a decisão projeto a projeto (Carryover Desenvolvimento / Carryover Hold / Cancelar / Reverter) — substituindo a antiga tela "Projetos Carry Over"; o seletor de Ano Fiscal do Dashboard/Roadmap/Financeiro/Consulta passa a ser alimentado pela configuração de Anos Fiscais (lista de todos os AFs cadastrados + "Todos" + "Pipeline"), não mais pela data do dia; o Quadro de Orçamento ganhou duas linhas de contagem de projetos e separou o Carry Over em "Em Andamento" e "Em Hold"; o quadro "Projetos na Criação do Ano Fiscal" ganhou a linha de cancelados; o Detalhamento do Projeto teve o cabeçalho reorganizado e ganhou a seção "Decisões de Fechamento"; e o Termo de Aceite do Go-Live passou a ser pré-requisito real da conclusão do projeto, não podendo ser registrado antes dos 100% de evolução. Novidades das revisões anteriores, ainda vigentes: papel PROPRIETÁRIO e Licenciamento de Módulos; permissões por atividade com quatro verbos (Consultar, Incluir, Alterar, Deletar); proteção no banco de dados (RLS) ativada nas tabelas centrais de controle de acesso; Cadastro de Produtos e associação obrigatória de Produto à demanda; Agrupamento de Orçamento por Ano Fiscal, Área ou Produto; tela de Ajuste de Orçamento; e padronização de nomenclatura (Ano Fiscal, Requerimentos, Especificação, Execução, Retorno/Benefícios de Projeto).</w:t>
       </w:r>
     </w:p>
     <w:p>
@@ -539,7 +539,7 @@
         <w:pStyle w:val="ListBullet"/>
       </w:pPr>
       <w:r>
-        <w:t>Ano Fiscal — abertura do ciclo orçamentário, Fechamento Ano Fiscal (avaliação consolidada do ano, botão de fechamento formal e a decisão de Carryover/Hold/Cancelamento projeto a projeto) e Ajuste de Orçamento.</w:t>
+        <w:t>Ano Fiscal — abertura do ciclo orçamentário, Fechamento Ano Fiscal (avaliação consolidada do ano, botão de fechamento formal e a decisão de Carryover/Hold/Cancelamento projeto a projeto), Ajuste de Orçamento e Validação de Trade-off Extraordinário.</w:t>
       </w:r>
     </w:p>
     <w:p>
@@ -611,7 +611,7 @@
         <w:pStyle w:val="ListBullet"/>
       </w:pPr>
       <w:r>
-        <w:t>Administração — fases/etapas do workflow, SLA, os três itens de Envio de E-mail, percentual de bloqueio de orçamento e responsáveis por atividade.</w:t>
+        <w:t>Administração — fases/etapas do workflow, SLA, os três itens de Envio de E-mail, percentual de bloqueio de orçamento, responsáveis por atividade, Controle Orçamentário e Período do Ano Fiscal.</w:t>
       </w:r>
     </w:p>
     <w:p>
@@ -857,7 +857,12 @@
     </w:p>
     <w:p>
       <w:r>
-        <w:t>O sistema é dividido em módulos — Workflow, E-mail, Financeiro e Planejamento Estratégico. Cada módulo tem um interruptor Ligado/Desligado. Um módulo desligado esconde todas as telas dele para todos os usuários, inclusive Administrador e Proprietário — não há exceção por papel. As telas de núcleo (login, perfis, parâmetros básicos) não pertencem a nenhum módulo e ficam sempre disponíveis.</w:t>
+        <w:t>O sistema é dividido em módulos — Workflow, E-mail, Financeiro e Planejamento Estratégico. Cada módulo tem um interruptor Ligado/Desligado. Um módulo desligado esconde todas as telas dele para todos os usuários, inclusive Administrador e Proprietário — não há exceção por papel. As telas de NÚCLEO ficam sempre disponíveis: login e perfis de acesso, cadastros base (Áreas, Produtos, Pessoas, Portes, Tipos, Cargos), Abertura e Período do Ano Fiscal, Dashboard e Consulta de Projetos, Licenciamento de Módulos e Ferramentas de Dev.</w:t>
+      </w:r>
+    </w:p>
+    <w:p>
+      <w:r>
+        <w:t>O que cada módulo destrava está registrado numa tabela de configuração (tela → módulo), não mais fixo no código. Destaques do Financeiro: além de Contratos &amp; Terceiros e das aprovações de orçamento, ele inclui Controle Orçamentário, Ajuste de Orçamento, Validação de Trade-off Extraordinário e Aprovar Demanda Extraordinária — todas as funções de orçamento no mesmo módulo. Fases e Etapas do Workflow e SLA &amp; Prazos pertencem ao Workflow.</w:t>
       </w:r>
     </w:p>
     <w:p>
@@ -1359,9 +1364,115 @@
     </w:p>
     <w:p>
       <w:r>
-        <w:t>Enquanto essa autorização não existe, o trade-off da Extraordinária (5.6) bloqueia qualquer ação sobre um projeto de outro subgrupo, apontando esta tela como o caminho.</w:t>
+        <w:t>Esta tela continua existindo como registro de autorizações; a validação dos trade-offs que cruzam subgrupo passou a ser feita na tela nova descrita em 4.4.</w:t>
       </w:r>
     </w:p>
+    <w:p>
+      <w:pPr>
+        <w:pStyle w:val="Heading2"/>
+      </w:pPr>
+      <w:r>
+        <w:t>4.4 Validação de Trade-off Extraordinário</w:t>
+      </w:r>
+    </w:p>
+    <w:p>
+      <w:r>
+        <w:t>Onde: Ano Fiscal &gt; Validação de Trade-off Extraordinário. Consultam todos que têm a atividade; decidem (Aprovar/Rejeitar) GOVERNANÇA, Gestor de TI e sempre Administrador / Proprietário.</w:t>
+      </w:r>
+    </w:p>
+    <w:p>
+      <w:r>
+        <w:t>Quando o parâmetro "Controle Orçamentário" (15.9) está em Área ou Produto e uma simulação de trade-off da Demanda Extraordinária (5.6) inclui projetos de outro subgrupo, a aprovação naquela tela não aplica os efeitos na hora — cria uma pendência aqui. Nada muda nos projetos e a demanda Extraordinária continua em Business Case até a decisão nesta tela.</w:t>
+      </w:r>
+    </w:p>
+    <w:p>
+      <w:r>
+        <w:t>Cada pendência mostra o projeto Extraordinário, o modo de controle, o valor e a situação do AF resultante. O botão "Detalhar" abre a lista dos projetos do trade-off (com a ação de cada um e um selo "FORA" para os de outro subgrupo) e três painéis de situação orçamentária (orçado / realizado / saldo): do Ano Fiscal inteiro, do subgrupo do projeto Extraordinário, e por subgrupo envolvido no trade-off.</w:t>
+      </w:r>
+    </w:p>
+    <w:tbl>
+      <w:tblPr>
+        <w:tblStyle w:val="LightGrid-Accent1"/>
+        <w:tblW w:type="auto" w:w="0"/>
+        <w:tblLook w:firstColumn="1" w:firstRow="1" w:lastColumn="0" w:lastRow="0" w:noHBand="0" w:noVBand="1" w:val="04A0"/>
+      </w:tblPr>
+      <w:tblGrid>
+        <w:gridCol w:w="4153"/>
+        <w:gridCol w:w="4153"/>
+      </w:tblGrid>
+      <w:tr>
+        <w:tc>
+          <w:tcPr>
+            <w:tcW w:type="dxa" w:w="4153"/>
+          </w:tcPr>
+          <w:p>
+            <w:r>
+              <w:rPr>
+                <w:b/>
+              </w:rPr>
+              <w:t>Ação</w:t>
+            </w:r>
+          </w:p>
+        </w:tc>
+        <w:tc>
+          <w:tcPr>
+            <w:tcW w:type="dxa" w:w="4153"/>
+          </w:tcPr>
+          <w:p>
+            <w:r>
+              <w:rPr>
+                <w:b/>
+              </w:rPr>
+              <w:t>O que acontece</w:t>
+            </w:r>
+          </w:p>
+        </w:tc>
+      </w:tr>
+      <w:tr>
+        <w:tc>
+          <w:tcPr>
+            <w:tcW w:type="dxa" w:w="4153"/>
+          </w:tcPr>
+          <w:p>
+            <w:r>
+              <w:t>Aprovar</w:t>
+            </w:r>
+          </w:p>
+        </w:tc>
+        <w:tc>
+          <w:tcPr>
+            <w:tcW w:type="dxa" w:w="4153"/>
+          </w:tcPr>
+          <w:p>
+            <w:r>
+              <w:t>Exige um motivo. Aplica os trade-offs (Hold / Cancelar / Ceder Parte), promove a demanda Extraordinária para Requerimentos e registra a decisão (quem, quando, motivo).</w:t>
+            </w:r>
+          </w:p>
+        </w:tc>
+      </w:tr>
+      <w:tr>
+        <w:tc>
+          <w:tcPr>
+            <w:tcW w:type="dxa" w:w="4153"/>
+          </w:tcPr>
+          <w:p>
+            <w:r>
+              <w:t>Rejeitar</w:t>
+            </w:r>
+          </w:p>
+        </w:tc>
+        <w:tc>
+          <w:tcPr>
+            <w:tcW w:type="dxa" w:w="4153"/>
+          </w:tcPr>
+          <w:p>
+            <w:r>
+              <w:t>Exige um motivo. Descarta a simulação — nada é aplicado aos projetos; a demanda Extraordinária permanece em Business Case para uma nova simulação.</w:t>
+            </w:r>
+          </w:p>
+        </w:tc>
+      </w:tr>
+    </w:tbl>
     <w:p>
       <w:pPr>
         <w:pStyle w:val="Heading1"/>
@@ -1616,7 +1727,12 @@
     </w:p>
     <w:p>
       <w:r>
-        <w:t>Projetos já concluídos não aparecem como candidatos. Quando o Dashboard/Financeiro está agrupando por Área ou por Produto, o trade-off só deixa mexer no saldo de projetos do mesmo subgrupo da demanda Extraordinária — para cruzar subgrupos é preciso ter registrado antes a autorização em Ajuste de Orçamento (4.3).</w:t>
+        <w:t>Projetos já concluídos não aparecem como candidatos. A lista de projetos elegíveis ao trade-off segue o parâmetro "Controle Orçamentário" (Administração — 15.9): no modo Ano Fiscal (padrão), todos os projetos do AF; no modo Área, só os da mesma área do projeto Extraordinário; no modo Produto, só os do mesmo produto. A tabela separa "Mesmo &lt;área/produto&gt;" de "Outro &lt;área/produto&gt;".</w:t>
+      </w:r>
+    </w:p>
+    <w:p>
+      <w:r>
+        <w:t>É permitido escolher ações em projetos de outro subgrupo. Nesse caso, ao aprovar (com a simulação já dentro do orçamento), a rodada NÃO é aplicada na hora: vai para a fila de "Validação de Trade-off Extraordinário" (Ano Fiscal — 4.4). Um trade-off 100% dentro do subgrupo (ou com o modo em Ano Fiscal) é aprovado direto e a demanda Extraordinária segue para Requerimentos, como antes.</w:t>
       </w:r>
     </w:p>
     <w:p>
@@ -2467,6 +2583,11 @@
       </w:r>
     </w:p>
     <w:p>
+      <w:r>
+        <w:t>A linha do tempo (Gantt) começa no mês de início do Ano Fiscal configurado em Administração &gt; Período do Ano Fiscal (15.10) — com o padrão (abril) a grade vai de ABR a MAR, como sempre.</w:t>
+      </w:r>
+    </w:p>
+    <w:p>
       <w:pPr>
         <w:pStyle w:val="Heading2"/>
       </w:pPr>
@@ -2844,6 +2965,71 @@
     <w:p>
       <w:r>
         <w:t>Grupo próprio no menu, restrito a quem tem Acesso Irrestrito. Ferramentas de reinício/limpeza de dados de teste (resetar para Fase 1, limpar base mantendo só um AF, limpeza total, exclusão seletiva) e criação de projetos de teste já em qualquer fase — inclusive com Produto, que é obrigatório.</w:t>
+      </w:r>
+    </w:p>
+    <w:p>
+      <w:pPr>
+        <w:pStyle w:val="Heading2"/>
+      </w:pPr>
+      <w:r>
+        <w:t>15.9 Controle Orçamentário</w:t>
+      </w:r>
+    </w:p>
+    <w:p>
+      <w:r>
+        <w:t>Onde: Administração &gt; Controle Orçamentário. Administrador e Proprietário têm acesso por padrão; e, por ser uma atividade delegável, um Administrador pode conceder essa tela a outro perfil em Funções e Permissões (13.2).</w:t>
+      </w:r>
+    </w:p>
+    <w:p>
+      <w:r>
+        <w:t>Define o "modo de controle orçamentário" que rege quais projetos ficam elegíveis no trade-off da Aprovação de Demanda Extraordinária (5.6):</w:t>
+      </w:r>
+    </w:p>
+    <w:p>
+      <w:pPr>
+        <w:pStyle w:val="ListBullet"/>
+      </w:pPr>
+      <w:r>
+        <w:t>Ano Fiscal (padrão) — todos os projetos do Ano Fiscal.</w:t>
+      </w:r>
+    </w:p>
+    <w:p>
+      <w:pPr>
+        <w:pStyle w:val="ListBullet"/>
+      </w:pPr>
+      <w:r>
+        <w:t>Área — só os projetos da mesma área do projeto Extraordinário.</w:t>
+      </w:r>
+    </w:p>
+    <w:p>
+      <w:pPr>
+        <w:pStyle w:val="ListBullet"/>
+      </w:pPr>
+      <w:r>
+        <w:t>Produto — só os projetos do mesmo produto do projeto Extraordinário.</w:t>
+      </w:r>
+    </w:p>
+    <w:p>
+      <w:r>
+        <w:t>A tela só pede o modo — a vigência é automática: sempre o 1º dia do mês corrente. Cada alteração fica registrada com essa vigência e um log (quem, quando, modo anterior); o histórico mostra a faixa de vigência de cada valor (início → fim, sendo o fim o dia anterior à vigência seguinte). Este parâmetro NÃO altera o seletor "Agrupar orçamento por" do Dashboard e do Financeiro (12.2), que continua sendo escolha de tela. Trocar o modo também não reprocessa trade-offs já aprovados.</w:t>
+      </w:r>
+    </w:p>
+    <w:p>
+      <w:pPr>
+        <w:pStyle w:val="Heading2"/>
+      </w:pPr>
+      <w:r>
+        <w:t>15.10 Período do Ano Fiscal</w:t>
+      </w:r>
+    </w:p>
+    <w:p>
+      <w:r>
+        <w:t>Onde: Administração &gt; Período do Ano Fiscal. Restrito a Administrador ou Proprietário (não é delegável).</w:t>
+      </w:r>
+    </w:p>
+    <w:p>
+      <w:r>
+        <w:t>Define o mês em que o Ano Fiscal começa (12 meses corridos). Antes era fixo em abril; agora é configurável. A tela só pede o mês de início — a vigência é automática e sempre começa no 1º dia do mês corrente; o período anterior encerra no último dia do mês anterior a essa data (o usuário não digita datas). Datas anteriores à vigência continuam apuradas no período antigo; a partir dela vale o novo mês de início. Os quarters (Q1–Q4), os rótulos "AFxxxx" e a grade de meses do Roadmap (12.6) passam a refletir o período configurado. Enquanto nenhum período for cadastrado, o sistema usa abril–março, exatamente como antes. Cada alteração fica registrada com vigência e log, e o histórico mostra a faixa de cada período (início → fim).</w:t>
       </w:r>
     </w:p>
     <w:p>
@@ -3218,6 +3404,72 @@
           <w:p>
             <w:r>
               <w:t>Autorização formal registrada para mover orçamento entre subgrupos diferentes.</w:t>
+            </w:r>
+          </w:p>
+        </w:tc>
+      </w:tr>
+      <w:tr>
+        <w:tc>
+          <w:tcPr>
+            <w:tcW w:type="dxa" w:w="4153"/>
+          </w:tcPr>
+          <w:p>
+            <w:r>
+              <w:t>Modo de Controle Orçamentário</w:t>
+            </w:r>
+          </w:p>
+        </w:tc>
+        <w:tc>
+          <w:tcPr>
+            <w:tcW w:type="dxa" w:w="4153"/>
+          </w:tcPr>
+          <w:p>
+            <w:r>
+              <w:t>Parâmetro (Ano Fiscal / Área / Produto) que define quais projetos ficam elegíveis no trade-off da Demanda Extraordinária. Ver 15.9.</w:t>
+            </w:r>
+          </w:p>
+        </w:tc>
+      </w:tr>
+      <w:tr>
+        <w:tc>
+          <w:tcPr>
+            <w:tcW w:type="dxa" w:w="4153"/>
+          </w:tcPr>
+          <w:p>
+            <w:r>
+              <w:t>Validação de Trade-off</w:t>
+            </w:r>
+          </w:p>
+        </w:tc>
+        <w:tc>
+          <w:tcPr>
+            <w:tcW w:type="dxa" w:w="4153"/>
+          </w:tcPr>
+          <w:p>
+            <w:r>
+              <w:t>Fila de aprovação (menu Ano Fiscal) das simulações de trade-off que cruzam Área/Produto quando o modo de controle não é "Ano Fiscal". Ver 4.4.</w:t>
+            </w:r>
+          </w:p>
+        </w:tc>
+      </w:tr>
+      <w:tr>
+        <w:tc>
+          <w:tcPr>
+            <w:tcW w:type="dxa" w:w="4153"/>
+          </w:tcPr>
+          <w:p>
+            <w:r>
+              <w:t>Período do Ano Fiscal</w:t>
+            </w:r>
+          </w:p>
+        </w:tc>
+        <w:tc>
+          <w:tcPr>
+            <w:tcW w:type="dxa" w:w="4153"/>
+          </w:tcPr>
+          <w:p>
+            <w:r>
+              <w:t>Mês em que o Ano Fiscal começa, configurável com vigência (era abril fixo). Ver 15.10.</w:t>
             </w:r>
           </w:p>
         </w:tc>

</xml_diff>